<commit_message>
Add full screening of LILACS: 286 included studies
- Screen all 459 LILACS records (8 Oct 2026); 183 new studies charted and coded
- Extract serotype from full texts of the new studies (SciELO, journal sites, BVS)
- PRISMA flow diagram for updated review and LILACS screening log (S4)
- Regenerate figures, tables and statistics

Co-Authored-By: Claude Opus 5.5 <noreply@anthropic.com>
</commit_message>
<xml_diff>
--- a/tables/Table1_chronology.docx
+++ b/tables/Table1_chronology.docx
@@ -236,7 +236,7 @@
               <w:rPr>
                 <w:sz w:val="18"/>
               </w:rPr>
-              <w:t>10,20-24</w:t>
+              <w:t>10,20-26</w:t>
             </w:r>
           </w:p>
         </w:tc>
@@ -308,7 +308,7 @@
               <w:rPr>
                 <w:sz w:val="18"/>
               </w:rPr>
-              <w:t>11,25-29</w:t>
+              <w:t>11,27-33</w:t>
             </w:r>
           </w:p>
         </w:tc>
@@ -363,7 +363,7 @@
               <w:rPr>
                 <w:sz w:val="18"/>
               </w:rPr>
-              <w:t>DENV-4 waves in 2012–2013; yearly replacement of dominant serotype; large unreported fraction; rising burden and deaths; record local incidence in the South</w:t>
+              <w:t>DENV-4 waves in 2012–2013; yearly replacement of dominant serotype and lineages; large unreported fraction; rising burden and deaths; record local incidence in the South</w:t>
             </w:r>
           </w:p>
         </w:tc>
@@ -380,7 +380,7 @@
               <w:rPr>
                 <w:sz w:val="18"/>
               </w:rPr>
-              <w:t>32-38</w:t>
+              <w:t>36-43</w:t>
             </w:r>
           </w:p>
         </w:tc>
@@ -452,7 +452,7 @@
               <w:rPr>
                 <w:sz w:val="18"/>
               </w:rPr>
-              <w:t>2,3,39-43</w:t>
+              <w:t>2,3,44-48</w:t>
             </w:r>
           </w:p>
         </w:tc>

</xml_diff>